<commit_message>
updates latest version proposal
</commit_message>
<xml_diff>
--- a/00_BIMR/BIMR-Future-Materials-Innovators-Program-Application-2025_GCUCG_V4.docx
+++ b/00_BIMR/BIMR-Future-Materials-Innovators-Program-Application-2025_GCUCG_V4.docx
@@ -1912,6 +1912,7 @@
           <w:ilvl w:val="0"/>
           <w:numId w:val="2"/>
         </w:numPr>
+        <w:spacing w:after="240"/>
       </w:pPr>
       <w:r>
         <w:lastRenderedPageBreak/>
@@ -1988,18 +1989,8 @@
     <w:p>
       <w:pPr>
         <w:pStyle w:val="ListParagraph"/>
-      </w:pPr>
-    </w:p>
-    <w:p>
-      <w:pPr>
-        <w:pStyle w:val="ListParagraph"/>
         <w:jc w:val="center"/>
       </w:pPr>
-      <w:r>
-        <w:t>Fig. 1. Gantt chart listing milestones to be achieved over a 12-month period</w:t>
-      </w:r>
-    </w:p>
-    <w:p>
       <w:r>
         <w:rPr>
           <w:noProof/>
@@ -2007,16 +1998,16 @@
         <mc:AlternateContent>
           <mc:Choice Requires="wps">
             <w:drawing>
-              <wp:anchor distT="45720" distB="45720" distL="114300" distR="114300" simplePos="0" relativeHeight="251658240" behindDoc="0" locked="0" layoutInCell="1" allowOverlap="1" wp14:anchorId="1239791E" wp14:editId="23BC6EA9">
+              <wp:anchor distT="45720" distB="45720" distL="114300" distR="114300" simplePos="0" relativeHeight="251658240" behindDoc="0" locked="0" layoutInCell="1" allowOverlap="1" wp14:anchorId="1239791E" wp14:editId="5D180C8B">
                 <wp:simplePos x="0" y="0"/>
                 <wp:positionH relativeFrom="margin">
                   <wp:align>right</wp:align>
                 </wp:positionH>
                 <wp:positionV relativeFrom="paragraph">
-                  <wp:posOffset>343584</wp:posOffset>
+                  <wp:posOffset>343535</wp:posOffset>
                 </wp:positionV>
-                <wp:extent cx="5924550" cy="5122545"/>
-                <wp:effectExtent l="0" t="0" r="19050" b="20955"/>
+                <wp:extent cx="5924550" cy="5239193"/>
+                <wp:effectExtent l="0" t="0" r="19050" b="19050"/>
                 <wp:wrapSquare wrapText="bothSides"/>
                 <wp:docPr id="5" name="Text Box 2"/>
                 <wp:cNvGraphicFramePr>
@@ -2031,7 +2022,7 @@
                       <wps:spPr bwMode="auto">
                         <a:xfrm>
                           <a:off x="0" y="0"/>
-                          <a:ext cx="5924550" cy="5122545"/>
+                          <a:ext cx="5924550" cy="5239193"/>
                         </a:xfrm>
                         <a:prstGeom prst="rect">
                           <a:avLst/>
@@ -2205,6 +2196,9 @@
                               <w:t>perturbed attributes</w:t>
                             </w:r>
                             <w:r>
+                              <w:t xml:space="preserve"> (random changes in the original values of genes)</w:t>
+                            </w:r>
+                            <w:r>
                               <w:t xml:space="preserve"> and </w:t>
                             </w:r>
                             <w:r>
@@ -2229,19 +2223,76 @@
                               <w:t xml:space="preserve"> a sorted list </w:t>
                             </w:r>
                             <w:r>
+                              <w:rPr>
+                                <w:i/>
+                                <w:iCs/>
+                              </w:rPr>
+                              <w:t>k</w:t>
+                            </w:r>
+                            <w:r>
+                              <w:t xml:space="preserve"> </w:t>
+                            </w:r>
+                            <w:r>
                               <w:t xml:space="preserve">with </w:t>
                             </w:r>
                             <w:r>
-                              <w:t xml:space="preserve">the best-performing units at the top. The first </w:t>
-                            </w:r>
-                            <w:r>
+                              <w:t xml:space="preserve">the best-performing units at the top. </w:t>
+                            </w:r>
+                            <w:r>
+                              <w:t xml:space="preserve">The units in </w:t>
+                            </w:r>
+                            <w:r>
+                              <w:rPr>
+                                <w:i/>
+                                <w:iCs/>
+                              </w:rPr>
                               <w:t>k</w:t>
                             </w:r>
                             <w:r>
-                              <w:t xml:space="preserve"> units will be taken as seed to generate the next population</w:t>
-                            </w:r>
-                            <w:r>
-                              <w:t>. We will insert “mutations” to each child unit using a random value taken from a Gaussian probability distribution with mean 0 and standard deviation 1.</w:t>
+                              <w:t xml:space="preserve"> will be</w:t>
+                            </w:r>
+                            <w:r>
+                              <w:t xml:space="preserve"> </w:t>
+                            </w:r>
+                            <w:r>
+                              <w:t>taken as seed to generate the next population</w:t>
+                            </w:r>
+                            <w:r>
+                              <w:t xml:space="preserve"> (see </w:t>
+                            </w:r>
+                            <w:r>
+                              <w:rPr>
+                                <w:b/>
+                                <w:bCs/>
+                              </w:rPr>
+                              <w:t>ThM1</w:t>
+                            </w:r>
+                            <w:r>
+                              <w:t>)</w:t>
+                            </w:r>
+                            <w:r>
+                              <w:t>. We will insert “mutations” to each child unit using random value</w:t>
+                            </w:r>
+                            <w:r>
+                              <w:t>s</w:t>
+                            </w:r>
+                            <w:r>
+                              <w:t xml:space="preserve"> taken from a Gaussian probability distribution with mean 0 and standard deviation 1.</w:t>
+                            </w:r>
+                            <w:r>
+                              <w:t xml:space="preserve"> The use of this model </w:t>
+                            </w:r>
+                            <w:r>
+                              <w:t xml:space="preserve">as </w:t>
+                            </w:r>
+                            <w:r>
+                              <w:t xml:space="preserve">an iterative process produces refinement in the population’s average fitness, with parameter configurations that </w:t>
+                            </w:r>
+                            <w:r>
+                              <w:t xml:space="preserve">promote </w:t>
+                            </w:r>
+                            <w:r>
+                              <w:t>higher conductivity.</w:t>
                             </w:r>
                           </w:p>
                           <w:p/>
@@ -2250,10 +2301,16 @@
                               <w:t xml:space="preserve">The unique </w:t>
                             </w:r>
                             <w:r>
-                              <w:t xml:space="preserve">sequence of generations, </w:t>
-                            </w:r>
-                            <w:r>
-                              <w:t xml:space="preserve">started by a founder population </w:t>
+                              <w:t xml:space="preserve">evolutionary history </w:t>
+                            </w:r>
+                            <w:r>
+                              <w:t xml:space="preserve">of </w:t>
+                            </w:r>
+                            <w:r>
+                              <w:t xml:space="preserve">a population produced by </w:t>
+                            </w:r>
+                            <w:r>
+                              <w:t xml:space="preserve">a founder population </w:t>
                             </w:r>
                             <w:r>
                               <w:t>and iterated over a</w:t>
@@ -2268,7 +2325,10 @@
                               <w:t xml:space="preserve">is called a path. </w:t>
                             </w:r>
                             <w:r>
-                              <w:t xml:space="preserve">The model will integrate multiple paths to improve exploration of </w:t>
+                              <w:t xml:space="preserve">The project </w:t>
+                            </w:r>
+                            <w:r>
+                              <w:t xml:space="preserve">will integrate multiple paths to improve exploration of </w:t>
                             </w:r>
                             <w:r>
                               <w:t xml:space="preserve">the high dimensional space with the </w:t>
@@ -2305,7 +2365,11 @@
           </mc:Choice>
           <mc:Fallback>
             <w:pict>
-              <v:shape w14:anchorId="1239791E" id="_x0000_s1029" type="#_x0000_t202" style="position:absolute;margin-left:415.3pt;margin-top:27.05pt;width:466.5pt;height:403.35pt;z-index:251658240;visibility:visible;mso-wrap-style:square;mso-width-percent:0;mso-height-percent:0;mso-wrap-distance-left:9pt;mso-wrap-distance-top:3.6pt;mso-wrap-distance-right:9pt;mso-wrap-distance-bottom:3.6pt;mso-position-horizontal:right;mso-position-horizontal-relative:margin;mso-position-vertical:absolute;mso-position-vertical-relative:text;mso-width-percent:0;mso-height-percent:0;mso-width-relative:margin;mso-height-relative:margin;v-text-anchor:top" o:gfxdata="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">
+              <v:shapetype w14:anchorId="1239791E" id="_x0000_t202" coordsize="21600,21600" o:spt="202" path="m,l,21600r21600,l21600,xe">
+                <v:stroke joinstyle="miter"/>
+                <v:path gradientshapeok="t" o:connecttype="rect"/>
+              </v:shapetype>
+              <v:shape id="_x0000_s1029" type="#_x0000_t202" style="position:absolute;left:0;text-align:left;margin-left:415.3pt;margin-top:27.05pt;width:466.5pt;height:412.55pt;z-index:251658240;visibility:visible;mso-wrap-style:square;mso-width-percent:0;mso-height-percent:0;mso-wrap-distance-left:9pt;mso-wrap-distance-top:3.6pt;mso-wrap-distance-right:9pt;mso-wrap-distance-bottom:3.6pt;mso-position-horizontal:right;mso-position-horizontal-relative:margin;mso-position-vertical:absolute;mso-position-vertical-relative:text;mso-width-percent:0;mso-height-percent:0;mso-width-relative:margin;mso-height-relative:margin;v-text-anchor:top" o:gfxdata="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">
                 <v:textbox>
                   <w:txbxContent>
                     <w:p>
@@ -2463,6 +2527,9 @@
                         <w:t>perturbed attributes</w:t>
                       </w:r>
                       <w:r>
+                        <w:t xml:space="preserve"> (random changes in the original values of genes)</w:t>
+                      </w:r>
+                      <w:r>
                         <w:t xml:space="preserve"> and </w:t>
                       </w:r>
                       <w:r>
@@ -2487,19 +2554,76 @@
                         <w:t xml:space="preserve"> a sorted list </w:t>
                       </w:r>
                       <w:r>
+                        <w:rPr>
+                          <w:i/>
+                          <w:iCs/>
+                        </w:rPr>
+                        <w:t>k</w:t>
+                      </w:r>
+                      <w:r>
+                        <w:t xml:space="preserve"> </w:t>
+                      </w:r>
+                      <w:r>
                         <w:t xml:space="preserve">with </w:t>
                       </w:r>
                       <w:r>
-                        <w:t xml:space="preserve">the best-performing units at the top. The first </w:t>
-                      </w:r>
-                      <w:r>
+                        <w:t xml:space="preserve">the best-performing units at the top. </w:t>
+                      </w:r>
+                      <w:r>
+                        <w:t xml:space="preserve">The units in </w:t>
+                      </w:r>
+                      <w:r>
+                        <w:rPr>
+                          <w:i/>
+                          <w:iCs/>
+                        </w:rPr>
                         <w:t>k</w:t>
                       </w:r>
                       <w:r>
-                        <w:t xml:space="preserve"> units will be taken as seed to generate the next population</w:t>
-                      </w:r>
-                      <w:r>
-                        <w:t>. We will insert “mutations” to each child unit using a random value taken from a Gaussian probability distribution with mean 0 and standard deviation 1.</w:t>
+                        <w:t xml:space="preserve"> will be</w:t>
+                      </w:r>
+                      <w:r>
+                        <w:t xml:space="preserve"> </w:t>
+                      </w:r>
+                      <w:r>
+                        <w:t>taken as seed to generate the next population</w:t>
+                      </w:r>
+                      <w:r>
+                        <w:t xml:space="preserve"> (see </w:t>
+                      </w:r>
+                      <w:r>
+                        <w:rPr>
+                          <w:b/>
+                          <w:bCs/>
+                        </w:rPr>
+                        <w:t>ThM1</w:t>
+                      </w:r>
+                      <w:r>
+                        <w:t>)</w:t>
+                      </w:r>
+                      <w:r>
+                        <w:t>. We will insert “mutations” to each child unit using random value</w:t>
+                      </w:r>
+                      <w:r>
+                        <w:t>s</w:t>
+                      </w:r>
+                      <w:r>
+                        <w:t xml:space="preserve"> taken from a Gaussian probability distribution with mean 0 and standard deviation 1.</w:t>
+                      </w:r>
+                      <w:r>
+                        <w:t xml:space="preserve"> The use of this model </w:t>
+                      </w:r>
+                      <w:r>
+                        <w:t xml:space="preserve">as </w:t>
+                      </w:r>
+                      <w:r>
+                        <w:t xml:space="preserve">an iterative process produces refinement in the population’s average fitness, with parameter configurations that </w:t>
+                      </w:r>
+                      <w:r>
+                        <w:t xml:space="preserve">promote </w:t>
+                      </w:r>
+                      <w:r>
+                        <w:t>higher conductivity.</w:t>
                       </w:r>
                     </w:p>
                     <w:p/>
@@ -2508,10 +2632,16 @@
                         <w:t xml:space="preserve">The unique </w:t>
                       </w:r>
                       <w:r>
-                        <w:t xml:space="preserve">sequence of generations, </w:t>
-                      </w:r>
-                      <w:r>
-                        <w:t xml:space="preserve">started by a founder population </w:t>
+                        <w:t xml:space="preserve">evolutionary history </w:t>
+                      </w:r>
+                      <w:r>
+                        <w:t xml:space="preserve">of </w:t>
+                      </w:r>
+                      <w:r>
+                        <w:t xml:space="preserve">a population produced by </w:t>
+                      </w:r>
+                      <w:r>
+                        <w:t xml:space="preserve">a founder population </w:t>
                       </w:r>
                       <w:r>
                         <w:t>and iterated over a</w:t>
@@ -2526,7 +2656,10 @@
                         <w:t xml:space="preserve">is called a path. </w:t>
                       </w:r>
                       <w:r>
-                        <w:t xml:space="preserve">The model will integrate multiple paths to improve exploration of </w:t>
+                        <w:t xml:space="preserve">The project </w:t>
+                      </w:r>
+                      <w:r>
+                        <w:t xml:space="preserve">will integrate multiple paths to improve exploration of </w:t>
                       </w:r>
                       <w:r>
                         <w:t xml:space="preserve">the high dimensional space with the </w:t>
@@ -2551,6 +2684,9 @@
             </w:pict>
           </mc:Fallback>
         </mc:AlternateContent>
+      </w:r>
+      <w:r>
+        <w:t>Fig. 1. Gantt chart listing milestones to be achieved over a 12-month period</w:t>
       </w:r>
     </w:p>
     <w:p>
@@ -2654,10 +2790,20 @@
                               <w:rPr>
                                 <w:lang w:val="en-US"/>
                               </w:rPr>
-                              <w:t>(ThM</w:t>
-                            </w:r>
-                            <w:r>
-                              <w:rPr>
+                              <w:t>(</w:t>
+                            </w:r>
+                            <w:r>
+                              <w:rPr>
+                                <w:b/>
+                                <w:bCs/>
+                                <w:lang w:val="en-US"/>
+                              </w:rPr>
+                              <w:t>ThM</w:t>
+                            </w:r>
+                            <w:r>
+                              <w:rPr>
+                                <w:b/>
+                                <w:bCs/>
                                 <w:lang w:val="en-US"/>
                               </w:rPr>
                               <w:t>1</w:t>
@@ -2802,7 +2948,21 @@
                               <w:rPr>
                                 <w:lang w:val="en-US"/>
                               </w:rPr>
-                              <w:t>Theoretical model for stopping condition (ThM2):</w:t>
+                              <w:t>Theoretical model for stopping condition (</w:t>
+                            </w:r>
+                            <w:r>
+                              <w:rPr>
+                                <w:b/>
+                                <w:bCs/>
+                                <w:lang w:val="en-US"/>
+                              </w:rPr>
+                              <w:t>ThM2</w:t>
+                            </w:r>
+                            <w:r>
+                              <w:rPr>
+                                <w:lang w:val="en-US"/>
+                              </w:rPr>
+                              <w:t>):</w:t>
                             </w:r>
                           </w:p>
                           <w:p>
@@ -2924,15 +3084,69 @@
                           </w:p>
                           <w:p>
                             <w:pPr>
-                              <w:rPr>
+                              <w:spacing w:after="240"/>
+                              <w:rPr>
+                                <w:b/>
+                                <w:bCs/>
                                 <w:lang w:val="en-US"/>
                               </w:rPr>
                             </w:pPr>
                             <w:r>
                               <w:rPr>
-                                <w:lang w:val="en-US"/>
-                              </w:rPr>
-                              <w:t>Given a founder population of size n at time t=0</w:t>
+                                <w:b/>
+                                <w:bCs/>
+                                <w:lang w:val="en-US"/>
+                              </w:rPr>
+                              <w:t>A</w:t>
+                            </w:r>
+                            <w:r>
+                              <w:rPr>
+                                <w:b/>
+                                <w:bCs/>
+                                <w:lang w:val="en-US"/>
+                              </w:rPr>
+                              <w:t>lgorithm</w:t>
+                            </w:r>
+                          </w:p>
+                          <w:p>
+                            <w:pPr>
+                              <w:rPr>
+                                <w:lang w:val="en-US"/>
+                              </w:rPr>
+                            </w:pPr>
+                            <w:r>
+                              <w:rPr>
+                                <w:lang w:val="en-US"/>
+                              </w:rPr>
+                              <w:t xml:space="preserve">Given a founder population of size </w:t>
+                            </w:r>
+                            <w:r>
+                              <w:rPr>
+                                <w:i/>
+                                <w:iCs/>
+                                <w:lang w:val="en-US"/>
+                              </w:rPr>
+                              <w:t>n</w:t>
+                            </w:r>
+                            <w:r>
+                              <w:rPr>
+                                <w:lang w:val="en-US"/>
+                              </w:rPr>
+                              <w:t xml:space="preserve"> at time </w:t>
+                            </w:r>
+                            <w:r>
+                              <w:rPr>
+                                <w:i/>
+                                <w:iCs/>
+                                <w:lang w:val="en-US"/>
+                              </w:rPr>
+                              <w:t>t</w:t>
+                            </w:r>
+                            <w:r>
+                              <w:rPr>
+                                <w:lang w:val="en-US"/>
+                              </w:rPr>
+                              <w:t>=0</w:t>
                             </w:r>
                             <w:r>
                               <w:rPr>
@@ -2943,6 +3157,8 @@
                             <w:proofErr w:type="spellStart"/>
                             <w:r>
                               <w:rPr>
+                                <w:i/>
+                                <w:iCs/>
                                 <w:lang w:val="en-US"/>
                               </w:rPr>
                               <w:t>Oc</w:t>
@@ -3104,10 +3320,20 @@
                         <w:rPr>
                           <w:lang w:val="en-US"/>
                         </w:rPr>
-                        <w:t>(ThM</w:t>
-                      </w:r>
-                      <w:r>
-                        <w:rPr>
+                        <w:t>(</w:t>
+                      </w:r>
+                      <w:r>
+                        <w:rPr>
+                          <w:b/>
+                          <w:bCs/>
+                          <w:lang w:val="en-US"/>
+                        </w:rPr>
+                        <w:t>ThM</w:t>
+                      </w:r>
+                      <w:r>
+                        <w:rPr>
+                          <w:b/>
+                          <w:bCs/>
                           <w:lang w:val="en-US"/>
                         </w:rPr>
                         <w:t>1</w:t>
@@ -3152,7 +3378,7 @@
                                     <pic:cNvPicPr/>
                                   </pic:nvPicPr>
                                   <pic:blipFill>
-                                    <a:blip r:embed="rId12"/>
+                                    <a:blip r:embed="rId8"/>
                                     <a:stretch>
                                       <a:fillRect/>
                                     </a:stretch>
@@ -3213,7 +3439,7 @@
                                     <pic:cNvPicPr/>
                                   </pic:nvPicPr>
                                   <pic:blipFill>
-                                    <a:blip r:embed="rId13"/>
+                                    <a:blip r:embed="rId9"/>
                                     <a:stretch>
                                       <a:fillRect/>
                                     </a:stretch>
@@ -3252,7 +3478,21 @@
                         <w:rPr>
                           <w:lang w:val="en-US"/>
                         </w:rPr>
-                        <w:t>Theoretical model for stopping condition (ThM2):</w:t>
+                        <w:t>Theoretical model for stopping condition (</w:t>
+                      </w:r>
+                      <w:r>
+                        <w:rPr>
+                          <w:b/>
+                          <w:bCs/>
+                          <w:lang w:val="en-US"/>
+                        </w:rPr>
+                        <w:t>ThM2</w:t>
+                      </w:r>
+                      <w:r>
+                        <w:rPr>
+                          <w:lang w:val="en-US"/>
+                        </w:rPr>
+                        <w:t>):</w:t>
                       </w:r>
                     </w:p>
                     <w:p>
@@ -3282,7 +3522,7 @@
                                     <pic:cNvPicPr/>
                                   </pic:nvPicPr>
                                   <pic:blipFill>
-                                    <a:blip r:embed="rId14"/>
+                                    <a:blip r:embed="rId10"/>
                                     <a:stretch>
                                       <a:fillRect/>
                                     </a:stretch>
@@ -3344,7 +3584,7 @@
                                     <pic:cNvPicPr/>
                                   </pic:nvPicPr>
                                   <pic:blipFill>
-                                    <a:blip r:embed="rId15"/>
+                                    <a:blip r:embed="rId11"/>
                                     <a:stretch>
                                       <a:fillRect/>
                                     </a:stretch>
@@ -3374,15 +3614,69 @@
                     </w:p>
                     <w:p>
                       <w:pPr>
-                        <w:rPr>
+                        <w:spacing w:after="240"/>
+                        <w:rPr>
+                          <w:b/>
+                          <w:bCs/>
                           <w:lang w:val="en-US"/>
                         </w:rPr>
                       </w:pPr>
                       <w:r>
                         <w:rPr>
-                          <w:lang w:val="en-US"/>
-                        </w:rPr>
-                        <w:t>Given a founder population of size n at time t=0</w:t>
+                          <w:b/>
+                          <w:bCs/>
+                          <w:lang w:val="en-US"/>
+                        </w:rPr>
+                        <w:t>A</w:t>
+                      </w:r>
+                      <w:r>
+                        <w:rPr>
+                          <w:b/>
+                          <w:bCs/>
+                          <w:lang w:val="en-US"/>
+                        </w:rPr>
+                        <w:t>lgorithm</w:t>
+                      </w:r>
+                    </w:p>
+                    <w:p>
+                      <w:pPr>
+                        <w:rPr>
+                          <w:lang w:val="en-US"/>
+                        </w:rPr>
+                      </w:pPr>
+                      <w:r>
+                        <w:rPr>
+                          <w:lang w:val="en-US"/>
+                        </w:rPr>
+                        <w:t xml:space="preserve">Given a founder population of size </w:t>
+                      </w:r>
+                      <w:r>
+                        <w:rPr>
+                          <w:i/>
+                          <w:iCs/>
+                          <w:lang w:val="en-US"/>
+                        </w:rPr>
+                        <w:t>n</w:t>
+                      </w:r>
+                      <w:r>
+                        <w:rPr>
+                          <w:lang w:val="en-US"/>
+                        </w:rPr>
+                        <w:t xml:space="preserve"> at time </w:t>
+                      </w:r>
+                      <w:r>
+                        <w:rPr>
+                          <w:i/>
+                          <w:iCs/>
+                          <w:lang w:val="en-US"/>
+                        </w:rPr>
+                        <w:t>t</w:t>
+                      </w:r>
+                      <w:r>
+                        <w:rPr>
+                          <w:lang w:val="en-US"/>
+                        </w:rPr>
+                        <w:t>=0</w:t>
                       </w:r>
                       <w:r>
                         <w:rPr>
@@ -3393,6 +3687,8 @@
                       <w:proofErr w:type="spellStart"/>
                       <w:r>
                         <w:rPr>
+                          <w:i/>
+                          <w:iCs/>
                           <w:lang w:val="en-US"/>
                         </w:rPr>
                         <w:t>Oc</w:t>
@@ -3426,13 +3722,7 @@
                         <w:rPr>
                           <w:lang w:val="en-US"/>
                         </w:rPr>
-                        <w:t xml:space="preserve">randomly sampling among the top k units </w:t>
-                      </w:r>
-                      <w:r>
-                        <w:rPr>
-                          <w:lang w:val="en-US"/>
-                        </w:rPr>
-                        <w:t>with the highest fitness</w:t>
+                        <w:t>randomly sampling among the top k units with the highest fitness</w:t>
                       </w:r>
                       <w:r>
                         <w:rPr>
@@ -3513,28 +3803,23 @@
         </w:numPr>
       </w:pPr>
       <w:r>
-        <w:lastRenderedPageBreak/>
-        <w:t>Please explain the collaborative nature of this project.  Explain why this work can’t be done without the combined expertise of the collaborating groups (500 words max).</w:t>
-      </w:r>
-    </w:p>
-    <w:p>
-      <w:r>
         <w:rPr>
           <w:noProof/>
         </w:rPr>
+        <w:lastRenderedPageBreak/>
         <mc:AlternateContent>
           <mc:Choice Requires="wps">
             <w:drawing>
-              <wp:anchor distT="45720" distB="45720" distL="114300" distR="114300" simplePos="0" relativeHeight="251661312" behindDoc="0" locked="0" layoutInCell="1" allowOverlap="1" wp14:anchorId="307DE8F2" wp14:editId="2B34E51D">
+              <wp:anchor distT="45720" distB="45720" distL="114300" distR="114300" simplePos="0" relativeHeight="251661312" behindDoc="0" locked="0" layoutInCell="1" allowOverlap="1" wp14:anchorId="307DE8F2" wp14:editId="603FDFE5">
                 <wp:simplePos x="0" y="0"/>
                 <wp:positionH relativeFrom="margin">
                   <wp:align>right</wp:align>
                 </wp:positionH>
                 <wp:positionV relativeFrom="paragraph">
-                  <wp:posOffset>360045</wp:posOffset>
+                  <wp:posOffset>503230</wp:posOffset>
                 </wp:positionV>
-                <wp:extent cx="5924550" cy="1238250"/>
-                <wp:effectExtent l="0" t="0" r="19050" b="19050"/>
+                <wp:extent cx="5924550" cy="1329055"/>
+                <wp:effectExtent l="0" t="0" r="19050" b="23495"/>
                 <wp:wrapSquare wrapText="bothSides"/>
                 <wp:docPr id="8" name="Text Box 2"/>
                 <wp:cNvGraphicFramePr>
@@ -3549,7 +3834,7 @@
                       <wps:spPr bwMode="auto">
                         <a:xfrm>
                           <a:off x="0" y="0"/>
-                          <a:ext cx="5924550" cy="1238492"/>
+                          <a:ext cx="5924550" cy="1329055"/>
                         </a:xfrm>
                         <a:prstGeom prst="rect">
                           <a:avLst/>
@@ -3570,7 +3855,13 @@
                         <w:txbxContent>
                           <w:p>
                             <w:r>
-                              <w:t>This project is a good opportunity to ensure collaboration across different specializations at McMaster, which include chemistry, materials development, and computer science. The theoretical models and data definitions that compose our project require a thorough understanding of crystallography, solid-state battery materials, and density functional theory. Moreover, the implementation of genetic algorithms demands a</w:t>
+                              <w:t xml:space="preserve">This project is a good opportunity to ensure collaboration across different specializations at McMaster, which include chemistry, materials development, and computer science. The </w:t>
+                            </w:r>
+                            <w:r>
+                              <w:t xml:space="preserve">implementation of the </w:t>
+                            </w:r>
+                            <w:r>
+                              <w:t>theoretical models and definitions that compose our project require a thorough understanding of crystallography, solid-state battery materials, and density functional theory. Moreover, the implementation of genetic algorithms demands a</w:t>
                             </w:r>
                             <w:r>
                               <w:t xml:space="preserve"> comprehensive</w:t>
@@ -3599,30 +3890,18 @@
           </mc:Choice>
           <mc:Fallback>
             <w:pict>
-              <v:shape w14:anchorId="307DE8F2" id="_x0000_s1031" type="#_x0000_t202" style="position:absolute;margin-left:415.3pt;margin-top:28.35pt;width:466.5pt;height:97.5pt;z-index:251661312;visibility:visible;mso-wrap-style:square;mso-width-percent:0;mso-height-percent:0;mso-wrap-distance-left:9pt;mso-wrap-distance-top:3.6pt;mso-wrap-distance-right:9pt;mso-wrap-distance-bottom:3.6pt;mso-position-horizontal:right;mso-position-horizontal-relative:margin;mso-position-vertical:absolute;mso-position-vertical-relative:text;mso-width-percent:0;mso-height-percent:0;mso-width-relative:margin;mso-height-relative:margin;v-text-anchor:top" o:gfxdata="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">
+              <v:shape w14:anchorId="307DE8F2" id="_x0000_s1031" type="#_x0000_t202" style="position:absolute;left:0;text-align:left;margin-left:415.3pt;margin-top:39.6pt;width:466.5pt;height:104.65pt;z-index:251661312;visibility:visible;mso-wrap-style:square;mso-width-percent:0;mso-height-percent:0;mso-wrap-distance-left:9pt;mso-wrap-distance-top:3.6pt;mso-wrap-distance-right:9pt;mso-wrap-distance-bottom:3.6pt;mso-position-horizontal:right;mso-position-horizontal-relative:margin;mso-position-vertical:absolute;mso-position-vertical-relative:text;mso-width-percent:0;mso-height-percent:0;mso-width-relative:margin;mso-height-relative:margin;v-text-anchor:top" o:gfxdata="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">
                 <v:textbox>
                   <w:txbxContent>
                     <w:p>
                       <w:r>
-                        <w:t>Th</w:t>
-                      </w:r>
-                      <w:r>
-                        <w:t>is</w:t>
-                      </w:r>
-                      <w:r>
-                        <w:t xml:space="preserve"> project is a good opportunity to ensure collaboration across different specializations at McMaster, which include chemistry, materials development, </w:t>
-                      </w:r>
-                      <w:r>
-                        <w:t xml:space="preserve">and </w:t>
-                      </w:r>
-                      <w:r>
-                        <w:t>computer science</w:t>
-                      </w:r>
-                      <w:r>
-                        <w:t>.</w:t>
-                      </w:r>
-                      <w:r>
-                        <w:t xml:space="preserve"> The theoretical models and data definitions that compose our project require a thorough understanding of crystallography, solid-state battery materials, and density functional theory. Moreover, the implementation of genetic algorithms demands a</w:t>
+                        <w:t xml:space="preserve">This project is a good opportunity to ensure collaboration across different specializations at McMaster, which include chemistry, materials development, and computer science. The </w:t>
+                      </w:r>
+                      <w:r>
+                        <w:t xml:space="preserve">implementation of the </w:t>
+                      </w:r>
+                      <w:r>
+                        <w:t>theoretical models and definitions that compose our project require a thorough understanding of crystallography, solid-state battery materials, and density functional theory. Moreover, the implementation of genetic algorithms demands a</w:t>
                       </w:r>
                       <w:r>
                         <w:t xml:space="preserve"> comprehensive</w:t>
@@ -3639,6 +3918,9 @@
             </w:pict>
           </mc:Fallback>
         </mc:AlternateContent>
+      </w:r>
+      <w:r>
+        <w:t>Please explain the collaborative nature of this project.  Explain why this work can’t be done without the combined expertise of the collaborating groups (500 words max).</w:t>
       </w:r>
     </w:p>
     <w:p>
@@ -3796,7 +4078,7 @@
                                           <pic:cNvPicPr/>
                                         </pic:nvPicPr>
                                         <pic:blipFill>
-                                          <a:blip r:embed="rId16"/>
+                                          <a:blip r:embed="rId12"/>
                                           <a:stretch>
                                             <a:fillRect/>
                                           </a:stretch>
@@ -3928,7 +4210,7 @@
                               <w:rPr>
                                 <w:lang w:val="en-US"/>
                               </w:rPr>
-                              <w:object w:dxaOrig="10147" w:dyaOrig="3368" w14:anchorId="255D7DC2">
+                              <w:object w:dxaOrig="10236" w:dyaOrig="3174" w14:anchorId="255D7DC2">
                                 <v:shapetype id="_x0000_t75" coordsize="21600,21600" o:spt="75" o:preferrelative="t" path="m@4@5l@4@11@9@11@9@5xe" filled="f" stroked="f">
                                   <v:stroke joinstyle="miter"/>
                                   <v:formulas>
@@ -3948,10 +4230,10 @@
                                   <v:path o:extrusionok="f" gradientshapeok="t" o:connecttype="rect"/>
                                   <o:lock v:ext="edit" aspectratio="t"/>
                                 </v:shapetype>
-                                <v:shape id="_x0000_i1039" type="#_x0000_t75" style="width:450.65pt;height:149.45pt">
-                                  <v:imagedata r:id="rId17" o:title=""/>
+                                <v:shape id="_x0000_i1026" type="#_x0000_t75" style="width:450.85pt;height:149.45pt">
+                                  <v:imagedata r:id="rId13" o:title=""/>
                                 </v:shape>
-                                <o:OLEObject Type="Embed" ProgID="Excel.Sheet.12" ShapeID="_x0000_i1039" DrawAspect="Content" ObjectID="_1803223943" r:id="rId18"/>
+                                <o:OLEObject Type="Embed" ProgID="Excel.Sheet.12" ShapeID="_x0000_i1026" DrawAspect="Content" ObjectID="_1803379142" r:id="rId14"/>
                               </w:object>
                             </w:r>
                           </w:p>

</xml_diff>